<commit_message>
Despliegue en Docker Backend y BD, actualizacion estadisticas globales, actualizacion gestion de reservas. Admin
</commit_message>
<xml_diff>
--- a/gestor_reservas_backend/backend_documentacion/10. Guardar en calendario.docx
+++ b/gestor_reservas_backend/backend_documentacion/10. Guardar en calendario.docx
@@ -68,27 +68,10 @@
           <w:b/>
           <w:bCs/>
         </w:rPr>
-        <w:t>.</w:t>
-      </w:r>
-      <w:proofErr w:type="spellStart"/>
-      <w:r>
-        <w:rPr>
-          <w:b/>
-          <w:bCs/>
-        </w:rPr>
-        <w:t>ics</w:t>
-      </w:r>
-      <w:proofErr w:type="spellEnd"/>
-      <w:r>
-        <w:t xml:space="preserve"> (</w:t>
-      </w:r>
-      <w:proofErr w:type="spellStart"/>
-      <w:r>
-        <w:t>iCalendar</w:t>
-      </w:r>
-      <w:proofErr w:type="spellEnd"/>
-      <w:r>
-        <w:t>). Este archivo es el "lenguaje universal" de los calendarios. Cuando un usuario de iPhone o Mac lo abre, se le añade la reserva automáticamente.</w:t>
+        <w:t>.ics</w:t>
+      </w:r>
+      <w:r>
+        <w:t xml:space="preserve"> (iCalendar). Este archivo es el "lenguaje universal" de los calendarios. Cuando un usuario de iPhone o Mac lo abre, se le añade la reserva automáticamente.</w:t>
       </w:r>
     </w:p>
     <w:p>
@@ -221,13 +204,8 @@
       <w:r>
         <w:t xml:space="preserve">Lo primero es instalar la librería </w:t>
       </w:r>
-      <w:proofErr w:type="spellStart"/>
-      <w:r>
-        <w:t>ics</w:t>
-      </w:r>
-      <w:proofErr w:type="spellEnd"/>
-      <w:r>
-        <w:t xml:space="preserve"> para Apple.</w:t>
+      <w:r>
+        <w:t>ics para Apple.</w:t>
       </w:r>
     </w:p>
     <w:p>
@@ -245,15 +223,7 @@
         <w:t>Compatibilidad Universal:</w:t>
       </w:r>
       <w:r>
-        <w:t xml:space="preserve"> Al enviar un archivo .</w:t>
-      </w:r>
-      <w:proofErr w:type="spellStart"/>
-      <w:r>
-        <w:t>ics</w:t>
-      </w:r>
-      <w:proofErr w:type="spellEnd"/>
-      <w:r>
-        <w:t xml:space="preserve"> como adjunto, cubres a todos los usuarios de Apple (iPhone, iPad, Mac) y también a los de Microsoft Outlook.</w:t>
+        <w:t xml:space="preserve"> Al enviar un archivo .ics como adjunto, cubres a todos los usuarios de Apple (iPhone, iPad, Mac) y también a los de Microsoft Outlook.</w:t>
       </w:r>
     </w:p>
     <w:p>
@@ -458,18 +428,8 @@
     </w:p>
     <w:p>
       <w:r>
-        <w:t xml:space="preserve">Actualizo </w:t>
-      </w:r>
-      <w:proofErr w:type="spellStart"/>
-      <w:proofErr w:type="gramStart"/>
-      <w:r>
-        <w:t>email.service</w:t>
-      </w:r>
-      <w:proofErr w:type="gramEnd"/>
-      <w:r>
-        <w:t>.ts</w:t>
-      </w:r>
-      <w:proofErr w:type="spellEnd"/>
+        <w:t>Actualizo email.service.ts</w:t>
+      </w:r>
     </w:p>
     <w:p>
       <w:r>
@@ -557,23 +517,7 @@
           <w:b/>
           <w:bCs/>
         </w:rPr>
-        <w:t>B. Para Apple y Outlook (Archivo .</w:t>
-      </w:r>
-      <w:proofErr w:type="spellStart"/>
-      <w:r>
-        <w:rPr>
-          <w:b/>
-          <w:bCs/>
-        </w:rPr>
-        <w:t>ics</w:t>
-      </w:r>
-      <w:proofErr w:type="spellEnd"/>
-      <w:r>
-        <w:rPr>
-          <w:b/>
-          <w:bCs/>
-        </w:rPr>
-        <w:t xml:space="preserve"> y Método REQUEST)</w:t>
+        <w:t>B. Para Apple y Outlook (Archivo .ics y Método REQUEST)</w:t>
       </w:r>
     </w:p>
     <w:p>
@@ -588,23 +532,7 @@
           <w:b/>
           <w:bCs/>
         </w:rPr>
-        <w:t xml:space="preserve">Librería </w:t>
-      </w:r>
-      <w:proofErr w:type="spellStart"/>
-      <w:r>
-        <w:rPr>
-          <w:b/>
-          <w:bCs/>
-        </w:rPr>
-        <w:t>ics</w:t>
-      </w:r>
-      <w:proofErr w:type="spellEnd"/>
-      <w:r>
-        <w:rPr>
-          <w:b/>
-          <w:bCs/>
-        </w:rPr>
-        <w:t>:</w:t>
+        <w:t>Librería ics:</w:t>
       </w:r>
       <w:r>
         <w:t xml:space="preserve"> Usamos esta librería para generar un archivo estándar de calendario (reserva-pista.ics).</w:t>
@@ -623,23 +551,7 @@
           <w:bCs/>
         </w:rPr>
         <w:lastRenderedPageBreak/>
-        <w:t xml:space="preserve">Atributo </w:t>
-      </w:r>
-      <w:proofErr w:type="spellStart"/>
-      <w:r>
-        <w:rPr>
-          <w:b/>
-          <w:bCs/>
-        </w:rPr>
-        <w:t>method</w:t>
-      </w:r>
-      <w:proofErr w:type="spellEnd"/>
-      <w:r>
-        <w:rPr>
-          <w:b/>
-          <w:bCs/>
-        </w:rPr>
-        <w:t>: REQUEST:</w:t>
+        <w:t>Atributo method: REQUEST:</w:t>
       </w:r>
       <w:r>
         <w:t xml:space="preserve"> Este es el cambio más importante. Al enviarlo con este "método", le estamos diciendo al iPhone que el correo </w:t>
@@ -667,52 +579,20 @@
           <w:b/>
           <w:bCs/>
         </w:rPr>
-        <w:t>Alternativas de Correo (</w:t>
-      </w:r>
-      <w:proofErr w:type="spellStart"/>
+        <w:t>Alternativas de Correo (mailOptions.alternatives):</w:t>
+      </w:r>
+      <w:r>
+        <w:t xml:space="preserve"> Además de enviar el archivo como un clip adjunto (attachment), lo inyectamos directamente en la estructura del email. Esto es lo que activa el banner de </w:t>
+      </w:r>
       <w:r>
         <w:rPr>
           <w:b/>
           <w:bCs/>
         </w:rPr>
-        <w:t>mailOptions.alternatives</w:t>
-      </w:r>
-      <w:proofErr w:type="spellEnd"/>
-      <w:r>
-        <w:rPr>
-          <w:b/>
-          <w:bCs/>
-        </w:rPr>
-        <w:t>):</w:t>
-      </w:r>
-      <w:r>
-        <w:t xml:space="preserve"> Además de enviar el archivo como un clip adjunto (</w:t>
-      </w:r>
-      <w:proofErr w:type="spellStart"/>
-      <w:r>
-        <w:t>attachment</w:t>
-      </w:r>
-      <w:proofErr w:type="spellEnd"/>
-      <w:r>
-        <w:t xml:space="preserve">), lo inyectamos directamente en la estructura del email. Esto es lo que activa el banner de </w:t>
-      </w:r>
-      <w:r>
-        <w:rPr>
-          <w:b/>
-          <w:bCs/>
-        </w:rPr>
         <w:t>"Evento encontrado"</w:t>
       </w:r>
       <w:r>
-        <w:t xml:space="preserve"> en la parte superior de la </w:t>
-      </w:r>
-      <w:proofErr w:type="gramStart"/>
-      <w:r>
-        <w:t>app</w:t>
-      </w:r>
-      <w:proofErr w:type="gramEnd"/>
-      <w:r>
-        <w:t xml:space="preserve"> Mail de Apple.</w:t>
+        <w:t xml:space="preserve"> en la parte superior de la app Mail de Apple.</w:t>
       </w:r>
     </w:p>
     <w:p/>
@@ -836,24 +716,13 @@
     </w:p>
     <w:p>
       <w:r>
-        <w:t xml:space="preserve">Actualizo el </w:t>
-      </w:r>
-      <w:proofErr w:type="spellStart"/>
-      <w:proofErr w:type="gramStart"/>
-      <w:r>
-        <w:t>reservation.controller</w:t>
-      </w:r>
-      <w:proofErr w:type="gramEnd"/>
-      <w:r>
-        <w:t>.ts</w:t>
-      </w:r>
-      <w:proofErr w:type="spellEnd"/>
+        <w:t>Actualizo el reservation.controller.ts</w:t>
+      </w:r>
     </w:p>
     <w:p>
       <w:r>
         <w:t xml:space="preserve">El problema principal que teníamos era que el </w:t>
       </w:r>
-      <w:proofErr w:type="spellStart"/>
       <w:r>
         <w:rPr>
           <w:b/>
@@ -861,7 +730,6 @@
         </w:rPr>
         <w:t>Webhook</w:t>
       </w:r>
-      <w:proofErr w:type="spellEnd"/>
       <w:r>
         <w:t xml:space="preserve"> de Stripe (que es quien confirma el pago) no sabía los detalles de la reserva (día, hora, deporte). Para solucionarlo, hicimos lo siguiente:</w:t>
       </w:r>
@@ -873,56 +741,15 @@
           <w:numId w:val="3"/>
         </w:numPr>
       </w:pPr>
-      <w:proofErr w:type="spellStart"/>
       <w:r>
         <w:rPr>
           <w:b/>
           <w:bCs/>
         </w:rPr>
-        <w:t>Metadata</w:t>
-      </w:r>
-      <w:proofErr w:type="spellEnd"/>
-      <w:r>
-        <w:rPr>
-          <w:b/>
-          <w:bCs/>
-        </w:rPr>
-        <w:t xml:space="preserve"> Reforzada:</w:t>
-      </w:r>
-      <w:r>
-        <w:t xml:space="preserve"> En la función </w:t>
-      </w:r>
-      <w:proofErr w:type="spellStart"/>
-      <w:r>
-        <w:t>createReservation</w:t>
-      </w:r>
-      <w:proofErr w:type="spellEnd"/>
-      <w:r>
-        <w:t xml:space="preserve">, cuando creamos la sesión de Stripe, ahora guardamos una "mochila" de datos llamada </w:t>
-      </w:r>
-      <w:proofErr w:type="spellStart"/>
-      <w:r>
-        <w:t>metadata</w:t>
-      </w:r>
-      <w:proofErr w:type="spellEnd"/>
-      <w:r>
-        <w:t xml:space="preserve">. Ahí metemos el sport, date, </w:t>
-      </w:r>
-      <w:proofErr w:type="spellStart"/>
-      <w:r>
-        <w:t>hour</w:t>
-      </w:r>
-      <w:proofErr w:type="spellEnd"/>
-      <w:r>
-        <w:t xml:space="preserve"> y </w:t>
-      </w:r>
-      <w:proofErr w:type="spellStart"/>
-      <w:r>
-        <w:t>courtName</w:t>
-      </w:r>
-      <w:proofErr w:type="spellEnd"/>
-      <w:r>
-        <w:t>.</w:t>
+        <w:t>Metadata Reforzada:</w:t>
+      </w:r>
+      <w:r>
+        <w:t xml:space="preserve"> En la función createReservation, cuando creamos la sesión de Stripe, ahora guardamos una "mochila" de datos llamada metadata. Ahí metemos el sport, date, hour y courtName.</w:t>
       </w:r>
     </w:p>
     <w:p>
@@ -937,34 +764,10 @@
           <w:b/>
           <w:bCs/>
         </w:rPr>
-        <w:t xml:space="preserve">Recuperación en el </w:t>
-      </w:r>
-      <w:proofErr w:type="spellStart"/>
-      <w:r>
-        <w:rPr>
-          <w:b/>
-          <w:bCs/>
-        </w:rPr>
-        <w:t>Webhook</w:t>
-      </w:r>
-      <w:proofErr w:type="spellEnd"/>
-      <w:r>
-        <w:rPr>
-          <w:b/>
-          <w:bCs/>
-        </w:rPr>
-        <w:t>:</w:t>
-      </w:r>
-      <w:r>
-        <w:t xml:space="preserve"> Cuando el pago se completa, Stripe nos devuelve esa "mochila". En el </w:t>
-      </w:r>
-      <w:proofErr w:type="spellStart"/>
-      <w:r>
-        <w:t>stripeWebhook</w:t>
-      </w:r>
-      <w:proofErr w:type="spellEnd"/>
-      <w:r>
-        <w:t>, extraemos esos datos.</w:t>
+        <w:t>Recuperación en el Webhook:</w:t>
+      </w:r>
+      <w:r>
+        <w:t xml:space="preserve"> Cuando el pago se completa, Stripe nos devuelve esa "mochila". En el stripeWebhook, extraemos esos datos.</w:t>
       </w:r>
     </w:p>
     <w:p>
@@ -1031,34 +834,10 @@
           <w:b/>
           <w:bCs/>
         </w:rPr>
-        <w:t xml:space="preserve">Stripe avisa al </w:t>
-      </w:r>
-      <w:proofErr w:type="spellStart"/>
-      <w:r>
-        <w:rPr>
-          <w:b/>
-          <w:bCs/>
-        </w:rPr>
-        <w:t>Webhook</w:t>
-      </w:r>
-      <w:proofErr w:type="spellEnd"/>
-      <w:r>
-        <w:rPr>
-          <w:b/>
-          <w:bCs/>
-        </w:rPr>
-        <w:t>:</w:t>
-      </w:r>
-      <w:r>
-        <w:t xml:space="preserve"> Envía la señal de "Pago OK" junto con la </w:t>
-      </w:r>
-      <w:proofErr w:type="spellStart"/>
-      <w:r>
-        <w:t>metadata</w:t>
-      </w:r>
-      <w:proofErr w:type="spellEnd"/>
-      <w:r>
-        <w:t xml:space="preserve"> (deporte, fecha, hora).</w:t>
+        <w:t>Stripe avisa al Webhook:</w:t>
+      </w:r>
+      <w:r>
+        <w:t xml:space="preserve"> Envía la señal de "Pago OK" junto con la metadata (deporte, fecha, hora).</w:t>
       </w:r>
     </w:p>
     <w:p>
@@ -1068,21 +847,12 @@
           <w:numId w:val="6"/>
         </w:numPr>
       </w:pPr>
-      <w:proofErr w:type="spellStart"/>
       <w:r>
         <w:rPr>
           <w:b/>
           <w:bCs/>
         </w:rPr>
-        <w:t>Controller</w:t>
-      </w:r>
-      <w:proofErr w:type="spellEnd"/>
-      <w:r>
-        <w:rPr>
-          <w:b/>
-          <w:bCs/>
-        </w:rPr>
-        <w:t xml:space="preserve"> procesa:</w:t>
+        <w:t>Controller procesa:</w:t>
       </w:r>
       <w:r>
         <w:t xml:space="preserve"> Recibe los datos, actualiza la base de datos a CONFIRMED y llama al servicio de email con la información completa.</w:t>
@@ -1122,15 +892,7 @@
         </w:numPr>
       </w:pPr>
       <w:r>
-        <w:t>Genera el archivo .</w:t>
-      </w:r>
-      <w:proofErr w:type="spellStart"/>
-      <w:r>
-        <w:t>ics</w:t>
-      </w:r>
-      <w:proofErr w:type="spellEnd"/>
-      <w:r>
-        <w:t xml:space="preserve"> para Apple/Outlook.</w:t>
+        <w:t>Genera el archivo .ics para Apple/Outlook.</w:t>
       </w:r>
     </w:p>
     <w:p>
@@ -1141,15 +903,7 @@
         </w:numPr>
       </w:pPr>
       <w:r>
-        <w:t xml:space="preserve">Genera el </w:t>
-      </w:r>
-      <w:proofErr w:type="gramStart"/>
-      <w:r>
-        <w:t>link</w:t>
-      </w:r>
-      <w:proofErr w:type="gramEnd"/>
-      <w:r>
-        <w:t xml:space="preserve"> para Google.</w:t>
+        <w:t>Genera el link para Google.</w:t>
       </w:r>
     </w:p>
     <w:p>
@@ -1160,28 +914,7 @@
         </w:numPr>
       </w:pPr>
       <w:r>
-        <w:t>Empaqueta todo con los tipos de datos correctos (</w:t>
-      </w:r>
-      <w:proofErr w:type="spellStart"/>
-      <w:proofErr w:type="gramStart"/>
-      <w:r>
-        <w:t>Typescript</w:t>
-      </w:r>
-      <w:proofErr w:type="spellEnd"/>
-      <w:r>
-        <w:t xml:space="preserve"> :</w:t>
-      </w:r>
-      <w:proofErr w:type="gramEnd"/>
-      <w:r>
-        <w:t xml:space="preserve"> </w:t>
-      </w:r>
-      <w:proofErr w:type="spellStart"/>
-      <w:r>
-        <w:t>any</w:t>
-      </w:r>
-      <w:proofErr w:type="spellEnd"/>
-      <w:r>
-        <w:t>).</w:t>
+        <w:t>Empaqueta todo con los tipos de datos correctos (Typescript : any).</w:t>
       </w:r>
     </w:p>
     <w:p>
@@ -1664,6 +1397,9 @@
         <w:tabs>
           <w:tab w:val="left" w:pos="1320"/>
         </w:tabs>
+        <w:rPr>
+          <w:noProof/>
+        </w:rPr>
       </w:pPr>
       <w:r>
         <w:rPr>
@@ -1718,6 +1454,153 @@
               </a:graphicData>
             </a:graphic>
           </wp:anchor>
+        </w:drawing>
+      </w:r>
+    </w:p>
+    <w:p/>
+    <w:p/>
+    <w:p/>
+    <w:p/>
+    <w:p/>
+    <w:p/>
+    <w:p/>
+    <w:p/>
+    <w:p/>
+    <w:p/>
+    <w:p/>
+    <w:p/>
+    <w:p/>
+    <w:p/>
+    <w:p/>
+    <w:p/>
+    <w:p/>
+    <w:p/>
+    <w:p/>
+    <w:p/>
+    <w:p/>
+    <w:p/>
+    <w:p>
+      <w:pPr>
+        <w:rPr>
+          <w:noProof/>
+        </w:rPr>
+      </w:pPr>
+    </w:p>
+    <w:p>
+      <w:r>
+        <w:drawing>
+          <wp:inline distT="0" distB="0" distL="0" distR="0" wp14:anchorId="170F3552" wp14:editId="5CDD4364">
+            <wp:extent cx="6645910" cy="346710"/>
+            <wp:effectExtent l="0" t="0" r="2540" b="0"/>
+            <wp:docPr id="2050277435" name="Imagen 1"/>
+            <wp:cNvGraphicFramePr>
+              <a:graphicFrameLocks xmlns:a="http://schemas.openxmlformats.org/drawingml/2006/main" noChangeAspect="1"/>
+            </wp:cNvGraphicFramePr>
+            <a:graphic xmlns:a="http://schemas.openxmlformats.org/drawingml/2006/main">
+              <a:graphicData uri="http://schemas.openxmlformats.org/drawingml/2006/picture">
+                <pic:pic xmlns:pic="http://schemas.openxmlformats.org/drawingml/2006/picture">
+                  <pic:nvPicPr>
+                    <pic:cNvPr id="2050277435" name=""/>
+                    <pic:cNvPicPr/>
+                  </pic:nvPicPr>
+                  <pic:blipFill>
+                    <a:blip r:embed="rId23"/>
+                    <a:stretch>
+                      <a:fillRect/>
+                    </a:stretch>
+                  </pic:blipFill>
+                  <pic:spPr>
+                    <a:xfrm>
+                      <a:off x="0" y="0"/>
+                      <a:ext cx="6645910" cy="346710"/>
+                    </a:xfrm>
+                    <a:prstGeom prst="rect">
+                      <a:avLst/>
+                    </a:prstGeom>
+                  </pic:spPr>
+                </pic:pic>
+              </a:graphicData>
+            </a:graphic>
+          </wp:inline>
+        </w:drawing>
+      </w:r>
+    </w:p>
+    <w:p>
+      <w:r>
+        <w:drawing>
+          <wp:inline distT="0" distB="0" distL="0" distR="0" wp14:anchorId="6C3DDB61" wp14:editId="2F996F1E">
+            <wp:extent cx="6645910" cy="444500"/>
+            <wp:effectExtent l="0" t="0" r="2540" b="0"/>
+            <wp:docPr id="2006226335" name="Imagen 1"/>
+            <wp:cNvGraphicFramePr>
+              <a:graphicFrameLocks xmlns:a="http://schemas.openxmlformats.org/drawingml/2006/main" noChangeAspect="1"/>
+            </wp:cNvGraphicFramePr>
+            <a:graphic xmlns:a="http://schemas.openxmlformats.org/drawingml/2006/main">
+              <a:graphicData uri="http://schemas.openxmlformats.org/drawingml/2006/picture">
+                <pic:pic xmlns:pic="http://schemas.openxmlformats.org/drawingml/2006/picture">
+                  <pic:nvPicPr>
+                    <pic:cNvPr id="2006226335" name=""/>
+                    <pic:cNvPicPr/>
+                  </pic:nvPicPr>
+                  <pic:blipFill>
+                    <a:blip r:embed="rId24"/>
+                    <a:stretch>
+                      <a:fillRect/>
+                    </a:stretch>
+                  </pic:blipFill>
+                  <pic:spPr>
+                    <a:xfrm>
+                      <a:off x="0" y="0"/>
+                      <a:ext cx="6645910" cy="444500"/>
+                    </a:xfrm>
+                    <a:prstGeom prst="rect">
+                      <a:avLst/>
+                    </a:prstGeom>
+                  </pic:spPr>
+                </pic:pic>
+              </a:graphicData>
+            </a:graphic>
+          </wp:inline>
+        </w:drawing>
+      </w:r>
+    </w:p>
+    <w:p>
+      <w:r>
+        <w:lastRenderedPageBreak/>
+        <w:drawing>
+          <wp:inline distT="0" distB="0" distL="0" distR="0" wp14:anchorId="52F8C89F" wp14:editId="7AA928B7">
+            <wp:extent cx="6645910" cy="1303655"/>
+            <wp:effectExtent l="0" t="0" r="2540" b="0"/>
+            <wp:docPr id="695980900" name="Imagen 1"/>
+            <wp:cNvGraphicFramePr>
+              <a:graphicFrameLocks xmlns:a="http://schemas.openxmlformats.org/drawingml/2006/main" noChangeAspect="1"/>
+            </wp:cNvGraphicFramePr>
+            <a:graphic xmlns:a="http://schemas.openxmlformats.org/drawingml/2006/main">
+              <a:graphicData uri="http://schemas.openxmlformats.org/drawingml/2006/picture">
+                <pic:pic xmlns:pic="http://schemas.openxmlformats.org/drawingml/2006/picture">
+                  <pic:nvPicPr>
+                    <pic:cNvPr id="695980900" name=""/>
+                    <pic:cNvPicPr/>
+                  </pic:nvPicPr>
+                  <pic:blipFill>
+                    <a:blip r:embed="rId25"/>
+                    <a:stretch>
+                      <a:fillRect/>
+                    </a:stretch>
+                  </pic:blipFill>
+                  <pic:spPr>
+                    <a:xfrm>
+                      <a:off x="0" y="0"/>
+                      <a:ext cx="6645910" cy="1303655"/>
+                    </a:xfrm>
+                    <a:prstGeom prst="rect">
+                      <a:avLst/>
+                    </a:prstGeom>
+                  </pic:spPr>
+                </pic:pic>
+              </a:graphicData>
+            </a:graphic>
+          </wp:inline>
         </w:drawing>
       </w:r>
     </w:p>

</xml_diff>